<commit_message>
Aggiornate le procedure 21 CFR, SIMATIC Logon e NTP con le versioni modificate da Mattia
Co-Authored-By: Claude Opus 5.5 <noreply@anthropic.com>
Claude-Session: https://claude.ai/code/session_017FNXRGi3qa62SAS8zgzmg1
</commit_message>
<xml_diff>
--- a/Procedure/Procedura_Sincronizzazione_NTP.docx
+++ b/Procedure/Procedura_Sincronizzazione_NTP.docx
@@ -34,23 +34,21 @@
     <w:p/>
     <w:tbl>
       <w:tblPr>
+        <w:tblW w:w="0" w:type="auto"/>
         <w:jc w:val="center"/>
-        <w:tblLook w:firstColumn="1" w:firstRow="1" w:lastColumn="0" w:lastRow="0" w:noHBand="0" w:noVBand="1" w:val="04A0"/>
-        <w:tblW w:w="9638" w:type="dxa"/>
-        <w:tblLayout w:type="fixed"/>
+        <w:tblLook w:val="04A0" w:firstRow="1" w:lastRow="0" w:firstColumn="1" w:lastColumn="0" w:noHBand="0" w:noVBand="1"/>
       </w:tblPr>
       <w:tblGrid>
-        <w:gridCol w:w="2600"/>
-        <w:gridCol w:w="7038"/>
+        <w:gridCol w:w="2598"/>
+        <w:gridCol w:w="7030"/>
       </w:tblGrid>
       <w:tr>
         <w:trPr>
-          <w:cantSplit/>
           <w:tblHeader/>
+          <w:jc w:val="center"/>
         </w:trPr>
         <w:tc>
           <w:tcPr>
-            <w:tcW w:type="dxa" w:w="4819"/>
             <w:tcW w:w="2600" w:type="dxa"/>
             <w:tcBorders>
               <w:top w:val="single" w:sz="4" w:space="0" w:color="A6A6A6"/>
@@ -67,9 +65,6 @@
             </w:tcMar>
           </w:tcPr>
           <w:p>
-            <w:pPr>
-              <w:spacing w:after="0"/>
-            </w:pPr>
             <w:r>
               <w:rPr>
                 <w:b/>
@@ -81,7 +76,6 @@
         </w:tc>
         <w:tc>
           <w:tcPr>
-            <w:tcW w:type="dxa" w:w="4819"/>
             <w:tcW w:w="7038" w:type="dxa"/>
             <w:tcBorders>
               <w:top w:val="single" w:sz="4" w:space="0" w:color="A6A6A6"/>
@@ -98,9 +92,6 @@
             </w:tcMar>
           </w:tcPr>
           <w:p>
-            <w:pPr>
-              <w:spacing w:after="0"/>
-            </w:pPr>
             <w:r>
               <w:rPr>
                 <w:b/>
@@ -113,11 +104,10 @@
       </w:tr>
       <w:tr>
         <w:trPr>
-          <w:cantSplit/>
+          <w:jc w:val="center"/>
         </w:trPr>
         <w:tc>
           <w:tcPr>
-            <w:tcW w:type="dxa" w:w="4819"/>
             <w:tcW w:w="2600" w:type="dxa"/>
             <w:tcBorders>
               <w:top w:val="single" w:sz="4" w:space="0" w:color="A6A6A6"/>
@@ -133,9 +123,6 @@
             </w:tcMar>
           </w:tcPr>
           <w:p>
-            <w:pPr>
-              <w:spacing w:after="0"/>
-            </w:pPr>
             <w:r>
               <w:t>Autore</w:t>
             </w:r>
@@ -143,7 +130,6 @@
         </w:tc>
         <w:tc>
           <w:tcPr>
-            <w:tcW w:type="dxa" w:w="4819"/>
             <w:tcW w:w="7038" w:type="dxa"/>
             <w:tcBorders>
               <w:top w:val="single" w:sz="4" w:space="0" w:color="A6A6A6"/>
@@ -159,9 +145,6 @@
             </w:tcMar>
           </w:tcPr>
           <w:p>
-            <w:pPr>
-              <w:spacing w:after="0"/>
-            </w:pPr>
             <w:r>
               <w:t>Mattia Boselli</w:t>
             </w:r>
@@ -170,11 +153,10 @@
       </w:tr>
       <w:tr>
         <w:trPr>
-          <w:cantSplit/>
+          <w:jc w:val="center"/>
         </w:trPr>
         <w:tc>
           <w:tcPr>
-            <w:tcW w:type="dxa" w:w="4819"/>
             <w:tcW w:w="2600" w:type="dxa"/>
             <w:tcBorders>
               <w:top w:val="single" w:sz="4" w:space="0" w:color="A6A6A6"/>
@@ -191,9 +173,6 @@
             </w:tcMar>
           </w:tcPr>
           <w:p>
-            <w:pPr>
-              <w:spacing w:after="0"/>
-            </w:pPr>
             <w:r>
               <w:t>Versione</w:t>
             </w:r>
@@ -201,7 +180,6 @@
         </w:tc>
         <w:tc>
           <w:tcPr>
-            <w:tcW w:type="dxa" w:w="4819"/>
             <w:tcW w:w="7038" w:type="dxa"/>
             <w:tcBorders>
               <w:top w:val="single" w:sz="4" w:space="0" w:color="A6A6A6"/>
@@ -218,9 +196,6 @@
             </w:tcMar>
           </w:tcPr>
           <w:p>
-            <w:pPr>
-              <w:spacing w:after="0"/>
-            </w:pPr>
             <w:r>
               <w:t>1.0</w:t>
             </w:r>
@@ -229,11 +204,10 @@
       </w:tr>
       <w:tr>
         <w:trPr>
-          <w:cantSplit/>
+          <w:jc w:val="center"/>
         </w:trPr>
         <w:tc>
           <w:tcPr>
-            <w:tcW w:type="dxa" w:w="4819"/>
             <w:tcW w:w="2600" w:type="dxa"/>
             <w:tcBorders>
               <w:top w:val="single" w:sz="4" w:space="0" w:color="A6A6A6"/>
@@ -249,9 +223,6 @@
             </w:tcMar>
           </w:tcPr>
           <w:p>
-            <w:pPr>
-              <w:spacing w:after="0"/>
-            </w:pPr>
             <w:r>
               <w:t>Data</w:t>
             </w:r>
@@ -259,7 +230,6 @@
         </w:tc>
         <w:tc>
           <w:tcPr>
-            <w:tcW w:type="dxa" w:w="4819"/>
             <w:tcW w:w="7038" w:type="dxa"/>
             <w:tcBorders>
               <w:top w:val="single" w:sz="4" w:space="0" w:color="A6A6A6"/>
@@ -275,9 +245,6 @@
             </w:tcMar>
           </w:tcPr>
           <w:p>
-            <w:pPr>
-              <w:spacing w:after="0"/>
-            </w:pPr>
             <w:r>
               <w:t>15/10/2026</w:t>
             </w:r>
@@ -286,11 +253,10 @@
       </w:tr>
       <w:tr>
         <w:trPr>
-          <w:cantSplit/>
+          <w:jc w:val="center"/>
         </w:trPr>
         <w:tc>
           <w:tcPr>
-            <w:tcW w:type="dxa" w:w="4819"/>
             <w:tcW w:w="2600" w:type="dxa"/>
             <w:tcBorders>
               <w:top w:val="single" w:sz="4" w:space="0" w:color="A6A6A6"/>
@@ -307,9 +273,6 @@
             </w:tcMar>
           </w:tcPr>
           <w:p>
-            <w:pPr>
-              <w:spacing w:after="0"/>
-            </w:pPr>
             <w:r>
               <w:t>Ambito</w:t>
             </w:r>
@@ -317,7 +280,6 @@
         </w:tc>
         <w:tc>
           <w:tcPr>
-            <w:tcW w:type="dxa" w:w="4819"/>
             <w:tcW w:w="7038" w:type="dxa"/>
             <w:tcBorders>
               <w:top w:val="single" w:sz="4" w:space="0" w:color="A6A6A6"/>
@@ -334,9 +296,6 @@
             </w:tcMar>
           </w:tcPr>
           <w:p>
-            <w:pPr>
-              <w:spacing w:after="0"/>
-            </w:pPr>
             <w:r>
               <w:t>Macchine 21 CFR Part 11 in cui gli eventi di Audit devono avere l'ora del server del cliente</w:t>
             </w:r>
@@ -456,6 +415,7 @@
         <w:spacing w:before="120" w:after="200"/>
         <w:ind w:left="200" w:right="200"/>
       </w:pPr>
+      <w:proofErr w:type="gramStart"/>
       <w:r>
         <w:rPr>
           <w:b/>
@@ -464,7 +424,11 @@
         <w:t xml:space="preserve">NOTA  </w:t>
       </w:r>
       <w:r>
-        <w:t>Le figure indicate come *schermata illustrativa* riproducono la disposizione dei campi di TIA Portal / STEP 7 per orientarsi; le voci possono variare leggermente con la versione del software e del firmware. Le altre figure sono schermate reali tratte dalle guide di riferimento.</w:t>
+        <w:t>Le</w:t>
+      </w:r>
+      <w:proofErr w:type="gramEnd"/>
+      <w:r>
+        <w:t xml:space="preserve"> figure indicate come *schermata illustrativa* riproducono la disposizione dei campi di TIA Portal / STEP 7 per orientarsi; le voci possono variare leggermente con la versione del software e del firmware. Le altre figure sono schermate reali tratte dalle guide di riferimento.</w:t>
       </w:r>
     </w:p>
     <w:p>
@@ -501,26 +465,29 @@
     <w:p>
       <w:pPr>
         <w:keepNext/>
-        <w:spacing w:before="240"/>
         <w:jc w:val="center"/>
       </w:pPr>
       <w:r>
+        <w:rPr>
+          <w:noProof/>
+        </w:rPr>
         <w:drawing>
-          <wp:inline xmlns:a="http://schemas.openxmlformats.org/drawingml/2006/main" xmlns:pic="http://schemas.openxmlformats.org/drawingml/2006/picture">
+          <wp:inline distT="0" distB="0" distL="0" distR="0" wp14:anchorId="76BB39BB" wp14:editId="07A2AB1B">
             <wp:extent cx="5580000" cy="2181273"/>
+            <wp:effectExtent l="0" t="0" r="0" b="0"/>
             <wp:docPr id="1" name="Picture 1"/>
             <wp:cNvGraphicFramePr>
-              <a:graphicFrameLocks noChangeAspect="1"/>
+              <a:graphicFrameLocks xmlns:a="http://schemas.openxmlformats.org/drawingml/2006/main" noChangeAspect="1"/>
             </wp:cNvGraphicFramePr>
-            <a:graphic>
+            <a:graphic xmlns:a="http://schemas.openxmlformats.org/drawingml/2006/main">
               <a:graphicData uri="http://schemas.openxmlformats.org/drawingml/2006/picture">
-                <pic:pic>
+                <pic:pic xmlns:pic="http://schemas.openxmlformats.org/drawingml/2006/picture">
                   <pic:nvPicPr>
                     <pic:cNvPr id="0" name="m_archi.png"/>
                     <pic:cNvPicPr/>
                   </pic:nvPicPr>
                   <pic:blipFill>
-                    <a:blip r:embed="rId22"/>
+                    <a:blip r:embed="rId8"/>
                     <a:stretch>
                       <a:fillRect/>
                     </a:stretch>
@@ -530,7 +497,9 @@
                       <a:off x="0" y="0"/>
                       <a:ext cx="5580000" cy="2181273"/>
                     </a:xfrm>
-                    <a:prstGeom prst="rect"/>
+                    <a:prstGeom prst="rect">
+                      <a:avLst/>
+                    </a:prstGeom>
                   </pic:spPr>
                 </pic:pic>
               </a:graphicData>
@@ -558,29 +527,28 @@
         <w:pStyle w:val="Titolo2"/>
       </w:pPr>
       <w:r>
+        <w:lastRenderedPageBreak/>
         <w:t>2.1 Dati da chiedere al cliente</w:t>
       </w:r>
     </w:p>
     <w:tbl>
       <w:tblPr>
+        <w:tblW w:w="0" w:type="auto"/>
         <w:jc w:val="center"/>
-        <w:tblLook w:firstColumn="1" w:firstRow="1" w:lastColumn="0" w:lastRow="0" w:noHBand="0" w:noVBand="1" w:val="04A0"/>
-        <w:tblW w:w="9638" w:type="dxa"/>
-        <w:tblLayout w:type="fixed"/>
+        <w:tblLook w:val="04A0" w:firstRow="1" w:lastRow="0" w:firstColumn="1" w:lastColumn="0" w:noHBand="0" w:noVBand="1"/>
       </w:tblPr>
       <w:tblGrid>
-        <w:gridCol w:w="3700"/>
-        <w:gridCol w:w="2700"/>
-        <w:gridCol w:w="3238"/>
+        <w:gridCol w:w="3696"/>
+        <w:gridCol w:w="2698"/>
+        <w:gridCol w:w="3234"/>
       </w:tblGrid>
       <w:tr>
         <w:trPr>
-          <w:cantSplit/>
           <w:tblHeader/>
+          <w:jc w:val="center"/>
         </w:trPr>
         <w:tc>
           <w:tcPr>
-            <w:tcW w:type="dxa" w:w="3213"/>
             <w:tcW w:w="3700" w:type="dxa"/>
             <w:tcBorders>
               <w:top w:val="single" w:sz="4" w:space="0" w:color="A6A6A6"/>
@@ -597,9 +565,6 @@
             </w:tcMar>
           </w:tcPr>
           <w:p>
-            <w:pPr>
-              <w:spacing w:after="0"/>
-            </w:pPr>
             <w:r>
               <w:rPr>
                 <w:b/>
@@ -611,7 +576,6 @@
         </w:tc>
         <w:tc>
           <w:tcPr>
-            <w:tcW w:type="dxa" w:w="3213"/>
             <w:tcW w:w="2700" w:type="dxa"/>
             <w:tcBorders>
               <w:top w:val="single" w:sz="4" w:space="0" w:color="A6A6A6"/>
@@ -628,9 +592,6 @@
             </w:tcMar>
           </w:tcPr>
           <w:p>
-            <w:pPr>
-              <w:spacing w:after="0"/>
-            </w:pPr>
             <w:r>
               <w:rPr>
                 <w:b/>
@@ -642,7 +603,6 @@
         </w:tc>
         <w:tc>
           <w:tcPr>
-            <w:tcW w:type="dxa" w:w="3213"/>
             <w:tcW w:w="3238" w:type="dxa"/>
             <w:tcBorders>
               <w:top w:val="single" w:sz="4" w:space="0" w:color="A6A6A6"/>
@@ -659,9 +619,6 @@
             </w:tcMar>
           </w:tcPr>
           <w:p>
-            <w:pPr>
-              <w:spacing w:after="0"/>
-            </w:pPr>
             <w:r>
               <w:rPr>
                 <w:b/>
@@ -674,11 +631,10 @@
       </w:tr>
       <w:tr>
         <w:trPr>
-          <w:cantSplit/>
+          <w:jc w:val="center"/>
         </w:trPr>
         <w:tc>
           <w:tcPr>
-            <w:tcW w:type="dxa" w:w="3213"/>
             <w:tcW w:w="3700" w:type="dxa"/>
             <w:tcBorders>
               <w:top w:val="single" w:sz="4" w:space="0" w:color="A6A6A6"/>
@@ -694,9 +650,6 @@
             </w:tcMar>
           </w:tcPr>
           <w:p>
-            <w:pPr>
-              <w:spacing w:after="0"/>
-            </w:pPr>
             <w:r>
               <w:t>Indirizzo IP del server NTP (fino a 4)</w:t>
             </w:r>
@@ -704,7 +657,6 @@
         </w:tc>
         <w:tc>
           <w:tcPr>
-            <w:tcW w:type="dxa" w:w="3213"/>
             <w:tcW w:w="2700" w:type="dxa"/>
             <w:tcBorders>
               <w:top w:val="single" w:sz="4" w:space="0" w:color="A6A6A6"/>
@@ -720,9 +672,6 @@
             </w:tcMar>
           </w:tcPr>
           <w:p>
-            <w:pPr>
-              <w:spacing w:after="0"/>
-            </w:pPr>
             <w:r>
               <w:t>192.168.10.1</w:t>
             </w:r>
@@ -730,7 +679,6 @@
         </w:tc>
         <w:tc>
           <w:tcPr>
-            <w:tcW w:type="dxa" w:w="3213"/>
             <w:tcW w:w="3238" w:type="dxa"/>
             <w:tcBorders>
               <w:top w:val="single" w:sz="4" w:space="0" w:color="A6A6A6"/>
@@ -746,9 +694,6 @@
             </w:tcMar>
           </w:tcPr>
           <w:p>
-            <w:pPr>
-              <w:spacing w:after="0"/>
-            </w:pPr>
             <w:r>
               <w:t>Server principale + eventuali di riserva</w:t>
             </w:r>
@@ -757,11 +702,10 @@
       </w:tr>
       <w:tr>
         <w:trPr>
-          <w:cantSplit/>
+          <w:jc w:val="center"/>
         </w:trPr>
         <w:tc>
           <w:tcPr>
-            <w:tcW w:type="dxa" w:w="3213"/>
             <w:tcW w:w="3700" w:type="dxa"/>
             <w:tcBorders>
               <w:top w:val="single" w:sz="4" w:space="0" w:color="A6A6A6"/>
@@ -778,17 +722,21 @@
             </w:tcMar>
           </w:tcPr>
           <w:p>
-            <w:pPr>
-              <w:spacing w:after="0"/>
-            </w:pPr>
             <w:r>
-              <w:t>IP, subnet e gateway per la porta del PLC verso la rete cliente</w:t>
+              <w:t xml:space="preserve">IP, </w:t>
+            </w:r>
+            <w:proofErr w:type="spellStart"/>
+            <w:r>
+              <w:t>subnet</w:t>
+            </w:r>
+            <w:proofErr w:type="spellEnd"/>
+            <w:r>
+              <w:t xml:space="preserve"> e gateway per la porta del PLC verso la rete cliente</w:t>
             </w:r>
           </w:p>
         </w:tc>
         <w:tc>
           <w:tcPr>
-            <w:tcW w:type="dxa" w:w="3213"/>
             <w:tcW w:w="2700" w:type="dxa"/>
             <w:tcBorders>
               <w:top w:val="single" w:sz="4" w:space="0" w:color="A6A6A6"/>
@@ -805,9 +753,6 @@
             </w:tcMar>
           </w:tcPr>
           <w:p>
-            <w:pPr>
-              <w:spacing w:after="0"/>
-            </w:pPr>
             <w:r>
               <w:t>192.168.10.50 / 255.255.255.0</w:t>
             </w:r>
@@ -815,7 +760,6 @@
         </w:tc>
         <w:tc>
           <w:tcPr>
-            <w:tcW w:type="dxa" w:w="3213"/>
             <w:tcW w:w="3238" w:type="dxa"/>
             <w:tcBorders>
               <w:top w:val="single" w:sz="4" w:space="0" w:color="A6A6A6"/>
@@ -832,9 +776,6 @@
             </w:tcMar>
           </w:tcPr>
           <w:p>
-            <w:pPr>
-              <w:spacing w:after="0"/>
-            </w:pPr>
             <w:r>
               <w:t>Il gateway serve se il server NTP è in un'altra sottorete</w:t>
             </w:r>
@@ -843,11 +784,10 @@
       </w:tr>
       <w:tr>
         <w:trPr>
-          <w:cantSplit/>
+          <w:jc w:val="center"/>
         </w:trPr>
         <w:tc>
           <w:tcPr>
-            <w:tcW w:type="dxa" w:w="3213"/>
             <w:tcW w:w="3700" w:type="dxa"/>
             <w:tcBorders>
               <w:top w:val="single" w:sz="4" w:space="0" w:color="A6A6A6"/>
@@ -863,9 +803,6 @@
             </w:tcMar>
           </w:tcPr>
           <w:p>
-            <w:pPr>
-              <w:spacing w:after="0"/>
-            </w:pPr>
             <w:r>
               <w:t>Porta UDP 123 aperta</w:t>
             </w:r>
@@ -873,7 +810,6 @@
         </w:tc>
         <w:tc>
           <w:tcPr>
-            <w:tcW w:type="dxa" w:w="3213"/>
             <w:tcW w:w="2700" w:type="dxa"/>
             <w:tcBorders>
               <w:top w:val="single" w:sz="4" w:space="0" w:color="A6A6A6"/>
@@ -889,9 +825,6 @@
             </w:tcMar>
           </w:tcPr>
           <w:p>
-            <w:pPr>
-              <w:spacing w:after="0"/>
-            </w:pPr>
             <w:r>
               <w:t>—</w:t>
             </w:r>
@@ -899,7 +832,6 @@
         </w:tc>
         <w:tc>
           <w:tcPr>
-            <w:tcW w:type="dxa" w:w="3213"/>
             <w:tcW w:w="3238" w:type="dxa"/>
             <w:tcBorders>
               <w:top w:val="single" w:sz="4" w:space="0" w:color="A6A6A6"/>
@@ -915,9 +847,6 @@
             </w:tcMar>
           </w:tcPr>
           <w:p>
-            <w:pPr>
-              <w:spacing w:after="0"/>
-            </w:pPr>
             <w:r>
               <w:t>Verso il server NTP, sul firewall del cliente</w:t>
             </w:r>
@@ -926,11 +855,10 @@
       </w:tr>
       <w:tr>
         <w:trPr>
-          <w:cantSplit/>
+          <w:jc w:val="center"/>
         </w:trPr>
         <w:tc>
           <w:tcPr>
-            <w:tcW w:type="dxa" w:w="3213"/>
             <w:tcW w:w="3700" w:type="dxa"/>
             <w:tcBorders>
               <w:top w:val="single" w:sz="4" w:space="0" w:color="A6A6A6"/>
@@ -947,9 +875,6 @@
             </w:tcMar>
           </w:tcPr>
           <w:p>
-            <w:pPr>
-              <w:spacing w:after="0"/>
-            </w:pPr>
             <w:r>
               <w:t>Fuso orario e ora legale</w:t>
             </w:r>
@@ -957,7 +882,6 @@
         </w:tc>
         <w:tc>
           <w:tcPr>
-            <w:tcW w:type="dxa" w:w="3213"/>
             <w:tcW w:w="2700" w:type="dxa"/>
             <w:tcBorders>
               <w:top w:val="single" w:sz="4" w:space="0" w:color="A6A6A6"/>
@@ -974,9 +898,6 @@
             </w:tcMar>
           </w:tcPr>
           <w:p>
-            <w:pPr>
-              <w:spacing w:after="0"/>
-            </w:pPr>
             <w:r>
               <w:t>UTC+01:00, ora legale attiva</w:t>
             </w:r>
@@ -984,7 +905,6 @@
         </w:tc>
         <w:tc>
           <w:tcPr>
-            <w:tcW w:type="dxa" w:w="3213"/>
             <w:tcW w:w="3238" w:type="dxa"/>
             <w:tcBorders>
               <w:top w:val="single" w:sz="4" w:space="0" w:color="A6A6A6"/>
@@ -1001,9 +921,6 @@
             </w:tcMar>
           </w:tcPr>
           <w:p>
-            <w:pPr>
-              <w:spacing w:after="0"/>
-            </w:pPr>
             <w:r>
               <w:t>Normalmente come lo stabilimento</w:t>
             </w:r>
@@ -1012,11 +929,10 @@
       </w:tr>
       <w:tr>
         <w:trPr>
-          <w:cantSplit/>
+          <w:jc w:val="center"/>
         </w:trPr>
         <w:tc>
           <w:tcPr>
-            <w:tcW w:type="dxa" w:w="3213"/>
             <w:tcW w:w="3700" w:type="dxa"/>
             <w:tcBorders>
               <w:top w:val="single" w:sz="4" w:space="0" w:color="A6A6A6"/>
@@ -1032,9 +948,6 @@
             </w:tcMar>
           </w:tcPr>
           <w:p>
-            <w:pPr>
-              <w:spacing w:after="0"/>
-            </w:pPr>
             <w:r>
               <w:t>Intervallo di sincronizzazione</w:t>
             </w:r>
@@ -1042,7 +955,6 @@
         </w:tc>
         <w:tc>
           <w:tcPr>
-            <w:tcW w:type="dxa" w:w="3213"/>
             <w:tcW w:w="2700" w:type="dxa"/>
             <w:tcBorders>
               <w:top w:val="single" w:sz="4" w:space="0" w:color="A6A6A6"/>
@@ -1058,9 +970,6 @@
             </w:tcMar>
           </w:tcPr>
           <w:p>
-            <w:pPr>
-              <w:spacing w:after="0"/>
-            </w:pPr>
             <w:r>
               <w:t>60 s</w:t>
             </w:r>
@@ -1068,7 +977,6 @@
         </w:tc>
         <w:tc>
           <w:tcPr>
-            <w:tcW w:type="dxa" w:w="3213"/>
             <w:tcW w:w="3238" w:type="dxa"/>
             <w:tcBorders>
               <w:top w:val="single" w:sz="4" w:space="0" w:color="A6A6A6"/>
@@ -1084,9 +992,6 @@
             </w:tcMar>
           </w:tcPr>
           <w:p>
-            <w:pPr>
-              <w:spacing w:after="0"/>
-            </w:pPr>
             <w:r>
               <w:t>Campo valori 10 … 86400 s</w:t>
             </w:r>
@@ -1105,6 +1010,7 @@
         <w:pStyle w:val="Titolo1"/>
       </w:pPr>
       <w:r>
+        <w:lastRenderedPageBreak/>
         <w:t>3. Prima di iniziare</w:t>
       </w:r>
     </w:p>
@@ -1165,7 +1071,15 @@
         </w:numPr>
       </w:pPr>
       <w:r>
-        <w:t>Fare un ping dal PC di service al server NTP, collegato alla stessa rete del PLC.</w:t>
+        <w:t xml:space="preserve">Fare un </w:t>
+      </w:r>
+      <w:proofErr w:type="spellStart"/>
+      <w:r>
+        <w:t>ping</w:t>
+      </w:r>
+      <w:proofErr w:type="spellEnd"/>
+      <w:r>
+        <w:t xml:space="preserve"> dal PC di service al server NTP, collegato alla stessa rete del PLC.</w:t>
       </w:r>
     </w:p>
     <w:p>
@@ -1283,7 +1197,23 @@
         <w:t>Indirizzi Ethernet</w:t>
       </w:r>
       <w:r>
-        <w:t xml:space="preserve"> impostare IP e subnet forniti dal cliente; se il server NTP è in un'altra sottorete spuntare </w:t>
+        <w:t xml:space="preserve"> impostare IP e </w:t>
+      </w:r>
+      <w:proofErr w:type="spellStart"/>
+      <w:r>
+        <w:t>subnet</w:t>
+      </w:r>
+      <w:proofErr w:type="spellEnd"/>
+      <w:r>
+        <w:t xml:space="preserve"> forniti dal cliente; se il server NTP è in un'altra sottorete </w:t>
+      </w:r>
+      <w:proofErr w:type="gramStart"/>
+      <w:r>
+        <w:t>spuntare</w:t>
+      </w:r>
+      <w:proofErr w:type="gramEnd"/>
+      <w:r>
+        <w:t xml:space="preserve"> </w:t>
       </w:r>
       <w:r>
         <w:rPr>
@@ -1398,27 +1328,36 @@
     </w:p>
     <w:p>
       <w:pPr>
+        <w:pStyle w:val="Paragrafoelenco"/>
+        <w:ind w:left="540"/>
+      </w:pPr>
+    </w:p>
+    <w:p>
+      <w:pPr>
         <w:keepNext/>
-        <w:spacing w:before="240"/>
         <w:jc w:val="center"/>
       </w:pPr>
       <w:r>
+        <w:rPr>
+          <w:noProof/>
+        </w:rPr>
         <w:drawing>
-          <wp:inline xmlns:a="http://schemas.openxmlformats.org/drawingml/2006/main" xmlns:pic="http://schemas.openxmlformats.org/drawingml/2006/picture">
+          <wp:inline distT="0" distB="0" distL="0" distR="0" wp14:anchorId="068ADB24" wp14:editId="1805ADA0">
             <wp:extent cx="5580000" cy="2840727"/>
+            <wp:effectExtent l="0" t="0" r="0" b="0"/>
             <wp:docPr id="2" name="Picture 2"/>
             <wp:cNvGraphicFramePr>
-              <a:graphicFrameLocks noChangeAspect="1"/>
+              <a:graphicFrameLocks xmlns:a="http://schemas.openxmlformats.org/drawingml/2006/main" noChangeAspect="1"/>
             </wp:cNvGraphicFramePr>
-            <a:graphic>
+            <a:graphic xmlns:a="http://schemas.openxmlformats.org/drawingml/2006/main">
               <a:graphicData uri="http://schemas.openxmlformats.org/drawingml/2006/picture">
-                <pic:pic>
+                <pic:pic xmlns:pic="http://schemas.openxmlformats.org/drawingml/2006/picture">
                   <pic:nvPicPr>
                     <pic:cNvPr id="0" name="m_tia_ntp.png"/>
                     <pic:cNvPicPr/>
                   </pic:nvPicPr>
                   <pic:blipFill>
-                    <a:blip r:embed="rId23"/>
+                    <a:blip r:embed="rId9"/>
                     <a:stretch>
                       <a:fillRect/>
                     </a:stretch>
@@ -1428,7 +1367,9 @@
                       <a:off x="0" y="0"/>
                       <a:ext cx="5580000" cy="2840727"/>
                     </a:xfrm>
-                    <a:prstGeom prst="rect"/>
+                    <a:prstGeom prst="rect">
+                      <a:avLst/>
+                    </a:prstGeom>
                   </pic:spPr>
                 </pic:pic>
               </a:graphicData>
@@ -1460,6 +1401,7 @@
         <w:spacing w:before="120" w:after="200"/>
         <w:ind w:left="200" w:right="200"/>
       </w:pPr>
+      <w:proofErr w:type="gramStart"/>
       <w:r>
         <w:rPr>
           <w:b/>
@@ -1468,7 +1410,11 @@
         <w:t xml:space="preserve">NOTA  </w:t>
       </w:r>
       <w:r>
-        <w:t>Se si usa un CP (es. CP 1543-1) per la rete del cliente, la stessa pagina "Sincronizzazione dell'ora" si trova nelle proprietà del CP (stessi parametri).</w:t>
+        <w:t>Se</w:t>
+      </w:r>
+      <w:proofErr w:type="gramEnd"/>
+      <w:r>
+        <w:t xml:space="preserve"> si usa un CP (es. CP 1543-1) per la rete del cliente, la stessa pagina "Sincronizzazione dell'ora" si trova nelle proprietà del CP (stessi parametri).</w:t>
       </w:r>
     </w:p>
     <w:p>
@@ -1562,6 +1508,7 @@
         </w:numPr>
       </w:pPr>
       <w:r>
+        <w:lastRenderedPageBreak/>
         <w:t xml:space="preserve">Spuntare </w:t>
       </w:r>
       <w:r>
@@ -1576,27 +1523,36 @@
     </w:p>
     <w:p>
       <w:pPr>
+        <w:pStyle w:val="Paragrafoelenco"/>
+        <w:ind w:left="540"/>
+      </w:pPr>
+    </w:p>
+    <w:p>
+      <w:pPr>
         <w:keepNext/>
-        <w:spacing w:before="240"/>
         <w:jc w:val="center"/>
       </w:pPr>
       <w:r>
+        <w:rPr>
+          <w:noProof/>
+        </w:rPr>
         <w:drawing>
-          <wp:inline xmlns:a="http://schemas.openxmlformats.org/drawingml/2006/main" xmlns:pic="http://schemas.openxmlformats.org/drawingml/2006/picture">
-            <wp:extent cx="5580000" cy="2637818"/>
+          <wp:inline distT="0" distB="0" distL="0" distR="0" wp14:anchorId="2CE299C9" wp14:editId="406A11C0">
+            <wp:extent cx="5402580" cy="2553946"/>
+            <wp:effectExtent l="0" t="0" r="7620" b="0"/>
             <wp:docPr id="3" name="Picture 3"/>
             <wp:cNvGraphicFramePr>
-              <a:graphicFrameLocks noChangeAspect="1"/>
+              <a:graphicFrameLocks xmlns:a="http://schemas.openxmlformats.org/drawingml/2006/main" noChangeAspect="1"/>
             </wp:cNvGraphicFramePr>
-            <a:graphic>
+            <a:graphic xmlns:a="http://schemas.openxmlformats.org/drawingml/2006/main">
               <a:graphicData uri="http://schemas.openxmlformats.org/drawingml/2006/picture">
-                <pic:pic>
+                <pic:pic xmlns:pic="http://schemas.openxmlformats.org/drawingml/2006/picture">
                   <pic:nvPicPr>
                     <pic:cNvPr id="0" name="m_tia_ora.png"/>
                     <pic:cNvPicPr/>
                   </pic:nvPicPr>
                   <pic:blipFill>
-                    <a:blip r:embed="rId24"/>
+                    <a:blip r:embed="rId10"/>
                     <a:stretch>
                       <a:fillRect/>
                     </a:stretch>
@@ -1604,9 +1560,11 @@
                   <pic:spPr>
                     <a:xfrm>
                       <a:off x="0" y="0"/>
-                      <a:ext cx="5580000" cy="2637818"/>
+                      <a:ext cx="5408892" cy="2556930"/>
                     </a:xfrm>
-                    <a:prstGeom prst="rect"/>
+                    <a:prstGeom prst="rect">
+                      <a:avLst/>
+                    </a:prstGeom>
                   </pic:spPr>
                 </pic:pic>
               </a:graphicData>
@@ -1636,24 +1594,22 @@
     </w:p>
     <w:tbl>
       <w:tblPr>
+        <w:tblW w:w="0" w:type="auto"/>
         <w:jc w:val="center"/>
-        <w:tblLook w:firstColumn="1" w:firstRow="1" w:lastColumn="0" w:lastRow="0" w:noHBand="0" w:noVBand="1" w:val="04A0"/>
-        <w:tblW w:w="9638" w:type="dxa"/>
-        <w:tblLayout w:type="fixed"/>
+        <w:tblLook w:val="04A0" w:firstRow="1" w:lastRow="0" w:firstColumn="1" w:lastColumn="0" w:noHBand="0" w:noVBand="1"/>
       </w:tblPr>
       <w:tblGrid>
-        <w:gridCol w:w="2600"/>
-        <w:gridCol w:w="3200"/>
-        <w:gridCol w:w="3838"/>
+        <w:gridCol w:w="2597"/>
+        <w:gridCol w:w="3197"/>
+        <w:gridCol w:w="3834"/>
       </w:tblGrid>
       <w:tr>
         <w:trPr>
-          <w:cantSplit/>
           <w:tblHeader/>
+          <w:jc w:val="center"/>
         </w:trPr>
         <w:tc>
           <w:tcPr>
-            <w:tcW w:type="dxa" w:w="3213"/>
             <w:tcW w:w="2600" w:type="dxa"/>
             <w:tcBorders>
               <w:top w:val="single" w:sz="4" w:space="0" w:color="A6A6A6"/>
@@ -1670,9 +1626,6 @@
             </w:tcMar>
           </w:tcPr>
           <w:p>
-            <w:pPr>
-              <w:spacing w:after="0"/>
-            </w:pPr>
             <w:r>
               <w:rPr>
                 <w:b/>
@@ -1684,7 +1637,6 @@
         </w:tc>
         <w:tc>
           <w:tcPr>
-            <w:tcW w:type="dxa" w:w="3213"/>
             <w:tcW w:w="3200" w:type="dxa"/>
             <w:tcBorders>
               <w:top w:val="single" w:sz="4" w:space="0" w:color="A6A6A6"/>
@@ -1701,9 +1653,6 @@
             </w:tcMar>
           </w:tcPr>
           <w:p>
-            <w:pPr>
-              <w:spacing w:after="0"/>
-            </w:pPr>
             <w:r>
               <w:rPr>
                 <w:b/>
@@ -1715,7 +1664,6 @@
         </w:tc>
         <w:tc>
           <w:tcPr>
-            <w:tcW w:type="dxa" w:w="3213"/>
             <w:tcW w:w="3838" w:type="dxa"/>
             <w:tcBorders>
               <w:top w:val="single" w:sz="4" w:space="0" w:color="A6A6A6"/>
@@ -1732,9 +1680,6 @@
             </w:tcMar>
           </w:tcPr>
           <w:p>
-            <w:pPr>
-              <w:spacing w:after="0"/>
-            </w:pPr>
             <w:r>
               <w:rPr>
                 <w:b/>
@@ -1747,11 +1692,10 @@
       </w:tr>
       <w:tr>
         <w:trPr>
-          <w:cantSplit/>
+          <w:jc w:val="center"/>
         </w:trPr>
         <w:tc>
           <w:tcPr>
-            <w:tcW w:type="dxa" w:w="3213"/>
             <w:tcW w:w="2600" w:type="dxa"/>
             <w:tcBorders>
               <w:top w:val="single" w:sz="4" w:space="0" w:color="A6A6A6"/>
@@ -1767,9 +1711,6 @@
             </w:tcMar>
           </w:tcPr>
           <w:p>
-            <w:pPr>
-              <w:spacing w:after="0"/>
-            </w:pPr>
             <w:r>
               <w:t>RD_SYS_T</w:t>
             </w:r>
@@ -1777,7 +1718,6 @@
         </w:tc>
         <w:tc>
           <w:tcPr>
-            <w:tcW w:type="dxa" w:w="3213"/>
             <w:tcW w:w="3200" w:type="dxa"/>
             <w:tcBorders>
               <w:top w:val="single" w:sz="4" w:space="0" w:color="A6A6A6"/>
@@ -1793,9 +1733,6 @@
             </w:tcMar>
           </w:tcPr>
           <w:p>
-            <w:pPr>
-              <w:spacing w:after="0"/>
-            </w:pPr>
             <w:r>
               <w:t>Ora di sistema (UTC)</w:t>
             </w:r>
@@ -1803,7 +1740,6 @@
         </w:tc>
         <w:tc>
           <w:tcPr>
-            <w:tcW w:type="dxa" w:w="3213"/>
             <w:tcW w:w="3838" w:type="dxa"/>
             <w:tcBorders>
               <w:top w:val="single" w:sz="4" w:space="0" w:color="A6A6A6"/>
@@ -1819,9 +1755,6 @@
             </w:tcMar>
           </w:tcPr>
           <w:p>
-            <w:pPr>
-              <w:spacing w:after="0"/>
-            </w:pPr>
             <w:r>
               <w:t>Confronti e calcoli indipendenti dall'ora legale</w:t>
             </w:r>
@@ -1830,11 +1763,10 @@
       </w:tr>
       <w:tr>
         <w:trPr>
-          <w:cantSplit/>
+          <w:jc w:val="center"/>
         </w:trPr>
         <w:tc>
           <w:tcPr>
-            <w:tcW w:type="dxa" w:w="3213"/>
             <w:tcW w:w="2600" w:type="dxa"/>
             <w:tcBorders>
               <w:top w:val="single" w:sz="4" w:space="0" w:color="A6A6A6"/>
@@ -1851,9 +1783,6 @@
             </w:tcMar>
           </w:tcPr>
           <w:p>
-            <w:pPr>
-              <w:spacing w:after="0"/>
-            </w:pPr>
             <w:r>
               <w:t>RD_LOC_T</w:t>
             </w:r>
@@ -1861,7 +1790,6 @@
         </w:tc>
         <w:tc>
           <w:tcPr>
-            <w:tcW w:type="dxa" w:w="3213"/>
             <w:tcW w:w="3200" w:type="dxa"/>
             <w:tcBorders>
               <w:top w:val="single" w:sz="4" w:space="0" w:color="A6A6A6"/>
@@ -1878,9 +1806,6 @@
             </w:tcMar>
           </w:tcPr>
           <w:p>
-            <w:pPr>
-              <w:spacing w:after="0"/>
-            </w:pPr>
             <w:r>
               <w:t>Ora locale (fuso + ora legale)</w:t>
             </w:r>
@@ -1888,7 +1813,6 @@
         </w:tc>
         <w:tc>
           <w:tcPr>
-            <w:tcW w:type="dxa" w:w="3213"/>
             <w:tcW w:w="3838" w:type="dxa"/>
             <w:tcBorders>
               <w:top w:val="single" w:sz="4" w:space="0" w:color="A6A6A6"/>
@@ -1905,9 +1829,6 @@
             </w:tcMar>
           </w:tcPr>
           <w:p>
-            <w:pPr>
-              <w:spacing w:after="0"/>
-            </w:pPr>
             <w:r>
               <w:t>Ora da mostrare / passare all'HMI e ai report</w:t>
             </w:r>
@@ -1916,11 +1837,10 @@
       </w:tr>
       <w:tr>
         <w:trPr>
-          <w:cantSplit/>
+          <w:jc w:val="center"/>
         </w:trPr>
         <w:tc>
           <w:tcPr>
-            <w:tcW w:type="dxa" w:w="3213"/>
             <w:tcW w:w="2600" w:type="dxa"/>
             <w:tcBorders>
               <w:top w:val="single" w:sz="4" w:space="0" w:color="A6A6A6"/>
@@ -1936,9 +1856,6 @@
             </w:tcMar>
           </w:tcPr>
           <w:p>
-            <w:pPr>
-              <w:spacing w:after="0"/>
-            </w:pPr>
             <w:r>
               <w:t>WR_SYS_T / WR_LOC_T</w:t>
             </w:r>
@@ -1946,7 +1863,6 @@
         </w:tc>
         <w:tc>
           <w:tcPr>
-            <w:tcW w:type="dxa" w:w="3213"/>
             <w:tcW w:w="3200" w:type="dxa"/>
             <w:tcBorders>
               <w:top w:val="single" w:sz="4" w:space="0" w:color="A6A6A6"/>
@@ -1962,9 +1878,6 @@
             </w:tcMar>
           </w:tcPr>
           <w:p>
-            <w:pPr>
-              <w:spacing w:after="0"/>
-            </w:pPr>
             <w:r>
               <w:t>Scrittura dell'ora</w:t>
             </w:r>
@@ -1972,7 +1885,6 @@
         </w:tc>
         <w:tc>
           <w:tcPr>
-            <w:tcW w:type="dxa" w:w="3213"/>
             <w:tcW w:w="3838" w:type="dxa"/>
             <w:tcBorders>
               <w:top w:val="single" w:sz="4" w:space="0" w:color="A6A6A6"/>
@@ -1988,9 +1900,6 @@
             </w:tcMar>
           </w:tcPr>
           <w:p>
-            <w:pPr>
-              <w:spacing w:after="0"/>
-            </w:pPr>
             <w:r>
               <w:rPr>
                 <w:b/>
@@ -2120,27 +2029,36 @@
     </w:p>
     <w:p>
       <w:pPr>
+        <w:pStyle w:val="Paragrafoelenco"/>
+        <w:ind w:left="540"/>
+      </w:pPr>
+    </w:p>
+    <w:p>
+      <w:pPr>
         <w:keepNext/>
-        <w:spacing w:before="240"/>
         <w:jc w:val="center"/>
       </w:pPr>
       <w:r>
+        <w:rPr>
+          <w:noProof/>
+        </w:rPr>
         <w:drawing>
-          <wp:inline xmlns:a="http://schemas.openxmlformats.org/drawingml/2006/main" xmlns:pic="http://schemas.openxmlformats.org/drawingml/2006/picture">
+          <wp:inline distT="0" distB="0" distL="0" distR="0" wp14:anchorId="065FD1CD" wp14:editId="25006085">
             <wp:extent cx="5580000" cy="2384182"/>
+            <wp:effectExtent l="0" t="0" r="0" b="0"/>
             <wp:docPr id="4" name="Picture 4"/>
             <wp:cNvGraphicFramePr>
-              <a:graphicFrameLocks noChangeAspect="1"/>
+              <a:graphicFrameLocks xmlns:a="http://schemas.openxmlformats.org/drawingml/2006/main" noChangeAspect="1"/>
             </wp:cNvGraphicFramePr>
-            <a:graphic>
+            <a:graphic xmlns:a="http://schemas.openxmlformats.org/drawingml/2006/main">
               <a:graphicData uri="http://schemas.openxmlformats.org/drawingml/2006/picture">
-                <pic:pic>
+                <pic:pic xmlns:pic="http://schemas.openxmlformats.org/drawingml/2006/picture">
                   <pic:nvPicPr>
                     <pic:cNvPr id="0" name="m_tia_online.png"/>
                     <pic:cNvPicPr/>
                   </pic:nvPicPr>
                   <pic:blipFill>
-                    <a:blip r:embed="rId25"/>
+                    <a:blip r:embed="rId11"/>
                     <a:stretch>
                       <a:fillRect/>
                     </a:stretch>
@@ -2150,7 +2068,9 @@
                       <a:off x="0" y="0"/>
                       <a:ext cx="5580000" cy="2384182"/>
                     </a:xfrm>
-                    <a:prstGeom prst="rect"/>
+                    <a:prstGeom prst="rect">
+                      <a:avLst/>
+                    </a:prstGeom>
                   </pic:spPr>
                 </pic:pic>
               </a:graphicData>
@@ -2173,11 +2093,7 @@
         <w:t>Figura 4 – Online &amp; diagnostica → Imposta ora: verifica (schermata illustrativa)</w:t>
       </w:r>
     </w:p>
-    <w:p>
-      <w:r>
-        <w:br w:type="page"/>
-      </w:r>
-    </w:p>
+    <w:p/>
     <w:p>
       <w:pPr>
         <w:pStyle w:val="Titolo1"/>
@@ -2223,8 +2139,16 @@
         <w:rPr>
           <w:b/>
         </w:rPr>
-        <w:t>HW Config</w:t>
-      </w:r>
+        <w:t xml:space="preserve">HW </w:t>
+      </w:r>
+      <w:proofErr w:type="spellStart"/>
+      <w:r>
+        <w:rPr>
+          <w:b/>
+        </w:rPr>
+        <w:t>Config</w:t>
+      </w:r>
+      <w:proofErr w:type="spellEnd"/>
       <w:r>
         <w:t xml:space="preserve"> della stazione.</w:t>
       </w:r>
@@ -2256,7 +2180,15 @@
         <w:t>Generale → Proprietà</w:t>
       </w:r>
       <w:r>
-        <w:t xml:space="preserve"> per impostare IP e subnet della rete cliente.</w:t>
+        <w:t xml:space="preserve"> per impostare IP e </w:t>
+      </w:r>
+      <w:proofErr w:type="spellStart"/>
+      <w:r>
+        <w:t>subnet</w:t>
+      </w:r>
+      <w:proofErr w:type="spellEnd"/>
+      <w:r>
+        <w:t xml:space="preserve"> della rete cliente.</w:t>
       </w:r>
     </w:p>
     <w:p>
@@ -2360,27 +2292,36 @@
     </w:p>
     <w:p>
       <w:pPr>
+        <w:pStyle w:val="Paragrafoelenco"/>
+        <w:ind w:left="540"/>
+      </w:pPr>
+    </w:p>
+    <w:p>
+      <w:pPr>
         <w:keepNext/>
-        <w:spacing w:before="240"/>
         <w:jc w:val="center"/>
       </w:pPr>
       <w:r>
+        <w:rPr>
+          <w:noProof/>
+        </w:rPr>
         <w:drawing>
-          <wp:inline xmlns:a="http://schemas.openxmlformats.org/drawingml/2006/main" xmlns:pic="http://schemas.openxmlformats.org/drawingml/2006/picture">
+          <wp:inline distT="0" distB="0" distL="0" distR="0" wp14:anchorId="1A8386E4" wp14:editId="42DA91A0">
             <wp:extent cx="4320000" cy="3160976"/>
+            <wp:effectExtent l="0" t="0" r="0" b="0"/>
             <wp:docPr id="5" name="Picture 5"/>
             <wp:cNvGraphicFramePr>
-              <a:graphicFrameLocks noChangeAspect="1"/>
+              <a:graphicFrameLocks xmlns:a="http://schemas.openxmlformats.org/drawingml/2006/main" noChangeAspect="1"/>
             </wp:cNvGraphicFramePr>
-            <a:graphic>
+            <a:graphic xmlns:a="http://schemas.openxmlformats.org/drawingml/2006/main">
               <a:graphicData uri="http://schemas.openxmlformats.org/drawingml/2006/picture">
-                <pic:pic>
+                <pic:pic xmlns:pic="http://schemas.openxmlformats.org/drawingml/2006/picture">
                   <pic:nvPicPr>
                     <pic:cNvPr id="0" name="m_s7_pn.png"/>
                     <pic:cNvPicPr/>
                   </pic:nvPicPr>
                   <pic:blipFill>
-                    <a:blip r:embed="rId26"/>
+                    <a:blip r:embed="rId12"/>
                     <a:stretch>
                       <a:fillRect/>
                     </a:stretch>
@@ -2390,7 +2331,9 @@
                       <a:off x="0" y="0"/>
                       <a:ext cx="4320000" cy="3160976"/>
                     </a:xfrm>
-                    <a:prstGeom prst="rect"/>
+                    <a:prstGeom prst="rect">
+                      <a:avLst/>
+                    </a:prstGeom>
                   </pic:spPr>
                 </pic:pic>
               </a:graphicData>
@@ -2410,7 +2353,25 @@
           <w:color w:val="595959"/>
           <w:sz w:val="18"/>
         </w:rPr>
-        <w:t>Figura 5 – HW Config: interfaccia PN-IO → Sincronizzazione dell'ora (schermata illustrativa)</w:t>
+        <w:t xml:space="preserve">Figura 5 – HW </w:t>
+      </w:r>
+      <w:proofErr w:type="spellStart"/>
+      <w:r>
+        <w:rPr>
+          <w:i/>
+          <w:color w:val="595959"/>
+          <w:sz w:val="18"/>
+        </w:rPr>
+        <w:t>Config</w:t>
+      </w:r>
+      <w:proofErr w:type="spellEnd"/>
+      <w:r>
+        <w:rPr>
+          <w:i/>
+          <w:color w:val="595959"/>
+          <w:sz w:val="18"/>
+        </w:rPr>
+        <w:t>: interfaccia PN-IO → Sincronizzazione dell'ora (schermata illustrativa)</w:t>
       </w:r>
     </w:p>
     <w:p>
@@ -2422,6 +2383,7 @@
         <w:spacing w:before="120" w:after="200"/>
         <w:ind w:left="200" w:right="200"/>
       </w:pPr>
+      <w:proofErr w:type="gramStart"/>
       <w:r>
         <w:rPr>
           <w:b/>
@@ -2430,7 +2392,11 @@
         <w:t xml:space="preserve">NOTA  </w:t>
       </w:r>
       <w:r>
-        <w:t xml:space="preserve">Con l'NTP sull'interfaccia integrata, nella scheda </w:t>
+        <w:t>Con</w:t>
+      </w:r>
+      <w:proofErr w:type="gramEnd"/>
+      <w:r>
+        <w:t xml:space="preserve"> l'NTP sull'interfaccia integrata, nella scheda </w:t>
       </w:r>
       <w:r>
         <w:rPr>
@@ -2473,7 +2439,15 @@
         </w:numPr>
       </w:pPr>
       <w:r>
-        <w:t xml:space="preserve">In HW Config doppio clic sul </w:t>
+        <w:t xml:space="preserve">In HW </w:t>
+      </w:r>
+      <w:proofErr w:type="spellStart"/>
+      <w:r>
+        <w:t>Config</w:t>
+      </w:r>
+      <w:proofErr w:type="spellEnd"/>
+      <w:r>
+        <w:t xml:space="preserve"> doppio clic sul </w:t>
       </w:r>
       <w:r>
         <w:rPr>
@@ -2491,7 +2465,15 @@
         <w:t>Sincronizzazione dell'ora</w:t>
       </w:r>
       <w:r>
-        <w:t xml:space="preserve"> (Time-of-Day Synchronization).</w:t>
+        <w:t xml:space="preserve"> (Time-of-Day </w:t>
+      </w:r>
+      <w:proofErr w:type="spellStart"/>
+      <w:r>
+        <w:t>Synchronization</w:t>
+      </w:r>
+      <w:proofErr w:type="spellEnd"/>
+      <w:r>
+        <w:t>).</w:t>
       </w:r>
     </w:p>
     <w:p>
@@ -2544,11 +2526,19 @@
       <w:r>
         <w:t xml:space="preserve">Con </w:t>
       </w:r>
-      <w:r>
-        <w:rPr>
-          <w:b/>
-        </w:rPr>
-        <w:t>Add…</w:t>
+      <w:proofErr w:type="spellStart"/>
+      <w:r>
+        <w:rPr>
+          <w:b/>
+        </w:rPr>
+        <w:t>Add</w:t>
+      </w:r>
+      <w:proofErr w:type="spellEnd"/>
+      <w:r>
+        <w:rPr>
+          <w:b/>
+        </w:rPr>
+        <w:t>…</w:t>
       </w:r>
       <w:r>
         <w:t xml:space="preserve"> inserire l'IP del server NTP.</w:t>
@@ -2578,8 +2568,16 @@
         <w:rPr>
           <w:b/>
         </w:rPr>
-        <w:t>Update interval</w:t>
-      </w:r>
+        <w:t xml:space="preserve">Update </w:t>
+      </w:r>
+      <w:proofErr w:type="spellStart"/>
+      <w:r>
+        <w:rPr>
+          <w:b/>
+        </w:rPr>
+        <w:t>interval</w:t>
+      </w:r>
+      <w:proofErr w:type="spellEnd"/>
       <w:r>
         <w:t xml:space="preserve"> (es. 60 s).</w:t>
       </w:r>
@@ -2629,26 +2627,30 @@
     <w:p>
       <w:pPr>
         <w:keepNext/>
-        <w:spacing w:before="240"/>
         <w:jc w:val="center"/>
       </w:pPr>
       <w:r>
+        <w:rPr>
+          <w:noProof/>
+        </w:rPr>
+        <w:lastRenderedPageBreak/>
         <w:drawing>
-          <wp:inline xmlns:a="http://schemas.openxmlformats.org/drawingml/2006/main" xmlns:pic="http://schemas.openxmlformats.org/drawingml/2006/picture">
+          <wp:inline distT="0" distB="0" distL="0" distR="0" wp14:anchorId="561174D3" wp14:editId="76BBAA5A">
             <wp:extent cx="5580000" cy="3028509"/>
+            <wp:effectExtent l="0" t="0" r="0" b="0"/>
             <wp:docPr id="6" name="Picture 6"/>
             <wp:cNvGraphicFramePr>
-              <a:graphicFrameLocks noChangeAspect="1"/>
+              <a:graphicFrameLocks xmlns:a="http://schemas.openxmlformats.org/drawingml/2006/main" noChangeAspect="1"/>
             </wp:cNvGraphicFramePr>
-            <a:graphic>
+            <a:graphic xmlns:a="http://schemas.openxmlformats.org/drawingml/2006/main">
               <a:graphicData uri="http://schemas.openxmlformats.org/drawingml/2006/picture">
-                <pic:pic>
+                <pic:pic xmlns:pic="http://schemas.openxmlformats.org/drawingml/2006/picture">
                   <pic:nvPicPr>
                     <pic:cNvPr id="0" name="u-026-066.png"/>
                     <pic:cNvPicPr/>
                   </pic:nvPicPr>
                   <pic:blipFill>
-                    <a:blip r:embed="rId27"/>
+                    <a:blip r:embed="rId13"/>
                     <a:stretch>
                       <a:fillRect/>
                     </a:stretch>
@@ -2658,7 +2660,9 @@
                       <a:off x="0" y="0"/>
                       <a:ext cx="5580000" cy="3028509"/>
                     </a:xfrm>
-                    <a:prstGeom prst="rect"/>
+                    <a:prstGeom prst="rect">
+                      <a:avLst/>
+                    </a:prstGeom>
                   </pic:spPr>
                 </pic:pic>
               </a:graphicData>
@@ -2684,26 +2688,29 @@
     <w:p>
       <w:pPr>
         <w:keepNext/>
-        <w:spacing w:before="240"/>
         <w:jc w:val="center"/>
       </w:pPr>
       <w:r>
+        <w:rPr>
+          <w:noProof/>
+        </w:rPr>
         <w:drawing>
-          <wp:inline xmlns:a="http://schemas.openxmlformats.org/drawingml/2006/main" xmlns:pic="http://schemas.openxmlformats.org/drawingml/2006/picture">
+          <wp:inline distT="0" distB="0" distL="0" distR="0" wp14:anchorId="18832786" wp14:editId="7A8FF7A6">
             <wp:extent cx="4320000" cy="2476098"/>
+            <wp:effectExtent l="0" t="0" r="0" b="0"/>
             <wp:docPr id="7" name="Picture 7"/>
             <wp:cNvGraphicFramePr>
-              <a:graphicFrameLocks noChangeAspect="1"/>
+              <a:graphicFrameLocks xmlns:a="http://schemas.openxmlformats.org/drawingml/2006/main" noChangeAspect="1"/>
             </wp:cNvGraphicFramePr>
-            <a:graphic>
+            <a:graphic xmlns:a="http://schemas.openxmlformats.org/drawingml/2006/main">
               <a:graphicData uri="http://schemas.openxmlformats.org/drawingml/2006/picture">
-                <pic:pic>
+                <pic:pic xmlns:pic="http://schemas.openxmlformats.org/drawingml/2006/picture">
                   <pic:nvPicPr>
                     <pic:cNvPr id="0" name="m_s7_clock.png"/>
                     <pic:cNvPicPr/>
                   </pic:nvPicPr>
                   <pic:blipFill>
-                    <a:blip r:embed="rId28"/>
+                    <a:blip r:embed="rId14"/>
                     <a:stretch>
                       <a:fillRect/>
                     </a:stretch>
@@ -2713,7 +2720,9 @@
                       <a:off x="0" y="0"/>
                       <a:ext cx="4320000" cy="2476098"/>
                     </a:xfrm>
-                    <a:prstGeom prst="rect"/>
+                    <a:prstGeom prst="rect">
+                      <a:avLst/>
+                    </a:prstGeom>
                   </pic:spPr>
                 </pic:pic>
               </a:graphicData>
@@ -2826,6 +2835,7 @@
         <w:pStyle w:val="Titolo1"/>
       </w:pPr>
       <w:r>
+        <w:lastRenderedPageBreak/>
         <w:t>6. Sincronizzazione dell'HMI dal PLC</w:t>
       </w:r>
     </w:p>
@@ -2934,27 +2944,36 @@
     </w:p>
     <w:p>
       <w:pPr>
+        <w:pStyle w:val="Paragrafoelenco"/>
+        <w:ind w:left="540"/>
+      </w:pPr>
+    </w:p>
+    <w:p>
+      <w:pPr>
         <w:keepNext/>
-        <w:spacing w:before="240"/>
         <w:jc w:val="center"/>
       </w:pPr>
       <w:r>
+        <w:rPr>
+          <w:noProof/>
+        </w:rPr>
         <w:drawing>
-          <wp:inline xmlns:a="http://schemas.openxmlformats.org/drawingml/2006/main" xmlns:pic="http://schemas.openxmlformats.org/drawingml/2006/picture">
+          <wp:inline distT="0" distB="0" distL="0" distR="0" wp14:anchorId="001C8F73" wp14:editId="62B7D0DE">
             <wp:extent cx="5580000" cy="1521818"/>
+            <wp:effectExtent l="0" t="0" r="0" b="0"/>
             <wp:docPr id="8" name="Picture 8"/>
             <wp:cNvGraphicFramePr>
-              <a:graphicFrameLocks noChangeAspect="1"/>
+              <a:graphicFrameLocks xmlns:a="http://schemas.openxmlformats.org/drawingml/2006/main" noChangeAspect="1"/>
             </wp:cNvGraphicFramePr>
-            <a:graphic>
+            <a:graphic xmlns:a="http://schemas.openxmlformats.org/drawingml/2006/main">
               <a:graphicData uri="http://schemas.openxmlformats.org/drawingml/2006/picture">
-                <pic:pic>
+                <pic:pic xmlns:pic="http://schemas.openxmlformats.org/drawingml/2006/picture">
                   <pic:nvPicPr>
                     <pic:cNvPr id="0" name="m_tia_hmi_conn.png"/>
                     <pic:cNvPicPr/>
                   </pic:nvPicPr>
                   <pic:blipFill>
-                    <a:blip r:embed="rId29"/>
+                    <a:blip r:embed="rId15"/>
                     <a:stretch>
                       <a:fillRect/>
                     </a:stretch>
@@ -2964,7 +2983,9 @@
                       <a:off x="0" y="0"/>
                       <a:ext cx="5580000" cy="1521818"/>
                     </a:xfrm>
-                    <a:prstGeom prst="rect"/>
+                    <a:prstGeom prst="rect">
+                      <a:avLst/>
+                    </a:prstGeom>
                   </pic:spPr>
                 </pic:pic>
               </a:graphicData>
@@ -2990,26 +3011,29 @@
     <w:p>
       <w:pPr>
         <w:keepNext/>
-        <w:spacing w:before="240"/>
         <w:jc w:val="center"/>
       </w:pPr>
       <w:r>
+        <w:rPr>
+          <w:noProof/>
+        </w:rPr>
         <w:drawing>
-          <wp:inline xmlns:a="http://schemas.openxmlformats.org/drawingml/2006/main" xmlns:pic="http://schemas.openxmlformats.org/drawingml/2006/picture">
+          <wp:inline distT="0" distB="0" distL="0" distR="0" wp14:anchorId="40D4C74A" wp14:editId="3DEE46A9">
             <wp:extent cx="5580000" cy="1193180"/>
+            <wp:effectExtent l="0" t="0" r="0" b="0"/>
             <wp:docPr id="9" name="Picture 9"/>
             <wp:cNvGraphicFramePr>
-              <a:graphicFrameLocks noChangeAspect="1"/>
+              <a:graphicFrameLocks xmlns:a="http://schemas.openxmlformats.org/drawingml/2006/main" noChangeAspect="1"/>
             </wp:cNvGraphicFramePr>
-            <a:graphic>
+            <a:graphic xmlns:a="http://schemas.openxmlformats.org/drawingml/2006/main">
               <a:graphicData uri="http://schemas.openxmlformats.org/drawingml/2006/picture">
-                <pic:pic>
+                <pic:pic xmlns:pic="http://schemas.openxmlformats.org/drawingml/2006/picture">
                   <pic:nvPicPr>
                     <pic:cNvPr id="0" name="u-025-064.png"/>
                     <pic:cNvPicPr/>
                   </pic:nvPicPr>
                   <pic:blipFill>
-                    <a:blip r:embed="rId30"/>
+                    <a:blip r:embed="rId16"/>
                     <a:stretch>
                       <a:fillRect/>
                     </a:stretch>
@@ -3019,7 +3043,9 @@
                       <a:off x="0" y="0"/>
                       <a:ext cx="5580000" cy="1193180"/>
                     </a:xfrm>
-                    <a:prstGeom prst="rect"/>
+                    <a:prstGeom prst="rect">
+                      <a:avLst/>
+                    </a:prstGeom>
                   </pic:spPr>
                 </pic:pic>
               </a:graphicData>
@@ -3051,6 +3077,7 @@
         <w:spacing w:before="120" w:after="200"/>
         <w:ind w:left="200" w:right="200"/>
       </w:pPr>
+      <w:proofErr w:type="gramStart"/>
       <w:r>
         <w:rPr>
           <w:b/>
@@ -3059,7 +3086,11 @@
         <w:t xml:space="preserve">ATTENZIONE  </w:t>
       </w:r>
       <w:r>
-        <w:t xml:space="preserve">Con il 21 CFR è </w:t>
+        <w:t>Con</w:t>
+      </w:r>
+      <w:proofErr w:type="gramEnd"/>
+      <w:r>
+        <w:t xml:space="preserve"> il 21 CFR è </w:t>
       </w:r>
       <w:r>
         <w:rPr>
@@ -3068,7 +3099,23 @@
         <w:t>obbligatorio</w:t>
       </w:r>
       <w:r>
-        <w:t xml:space="preserve"> che l'ora del runtime sovrascriva quella di Windows CE: verificare che il puntatore Data/ora PLC (o la modalità Slave) sia attivo.</w:t>
+        <w:t xml:space="preserve"> che l'ora del </w:t>
+      </w:r>
+      <w:proofErr w:type="spellStart"/>
+      <w:r>
+        <w:t>runtime</w:t>
+      </w:r>
+      <w:proofErr w:type="spellEnd"/>
+      <w:r>
+        <w:t xml:space="preserve"> sovrascriva quella di Windows CE: verificare che il puntatore Data/ora PLC (o la modalità </w:t>
+      </w:r>
+      <w:proofErr w:type="gramStart"/>
+      <w:r>
+        <w:t>Slave</w:t>
+      </w:r>
+      <w:proofErr w:type="gramEnd"/>
+      <w:r>
+        <w:t>) sia attivo.</w:t>
       </w:r>
     </w:p>
     <w:p>
@@ -3076,12 +3123,28 @@
         <w:pStyle w:val="Titolo2"/>
       </w:pPr>
       <w:r>
-        <w:t>6.2 Panel PC (WinCC Runtime Advanced)</w:t>
-      </w:r>
-    </w:p>
-    <w:p>
-      <w:r>
-        <w:t>Le impostazioni del progetto sono le stesse del pannello. In più, perché il runtime possa aggiornare l'orologio di Windows:</w:t>
+        <w:t>6.2 Panel PC (</w:t>
+      </w:r>
+      <w:proofErr w:type="spellStart"/>
+      <w:r>
+        <w:t>WinCC</w:t>
+      </w:r>
+      <w:proofErr w:type="spellEnd"/>
+      <w:r>
+        <w:t xml:space="preserve"> Runtime Advanced)</w:t>
+      </w:r>
+    </w:p>
+    <w:p>
+      <w:r>
+        <w:t xml:space="preserve">Le impostazioni del progetto sono le stesse del pannello. In più, perché il </w:t>
+      </w:r>
+      <w:proofErr w:type="spellStart"/>
+      <w:r>
+        <w:t>runtime</w:t>
+      </w:r>
+      <w:proofErr w:type="spellEnd"/>
+      <w:r>
+        <w:t xml:space="preserve"> possa aggiornare l'orologio di Windows:</w:t>
       </w:r>
     </w:p>
     <w:p>
@@ -3099,7 +3162,15 @@
         <w:t>Pannello di controllo → Account utente → Modifica impostazioni di Controllo account utente</w:t>
       </w:r>
       <w:r>
-        <w:t xml:space="preserve">: impostare </w:t>
+        <w:t xml:space="preserve">: </w:t>
+      </w:r>
+      <w:proofErr w:type="gramStart"/>
+      <w:r>
+        <w:t>impostare</w:t>
+      </w:r>
+      <w:proofErr w:type="gramEnd"/>
+      <w:r>
+        <w:t xml:space="preserve"> </w:t>
       </w:r>
       <w:r>
         <w:rPr>
@@ -3122,14 +3193,24 @@
       <w:r>
         <w:t xml:space="preserve">Proprietà del collegamento </w:t>
       </w:r>
+      <w:proofErr w:type="spellStart"/>
       <w:r>
         <w:rPr>
           <w:b/>
         </w:rPr>
         <w:t>StartCenter</w:t>
       </w:r>
-      <w:r>
-        <w:t xml:space="preserve"> di WinCC RT Advanced → </w:t>
+      <w:proofErr w:type="spellEnd"/>
+      <w:r>
+        <w:t xml:space="preserve"> di </w:t>
+      </w:r>
+      <w:proofErr w:type="spellStart"/>
+      <w:r>
+        <w:t>WinCC</w:t>
+      </w:r>
+      <w:proofErr w:type="spellEnd"/>
+      <w:r>
+        <w:t xml:space="preserve"> RT Advanced → </w:t>
       </w:r>
       <w:r>
         <w:rPr>
@@ -3138,7 +3219,15 @@
         <w:t>Avanzate…</w:t>
       </w:r>
       <w:r>
-        <w:t xml:space="preserve"> → spuntare </w:t>
+        <w:t xml:space="preserve"> → </w:t>
+      </w:r>
+      <w:proofErr w:type="gramStart"/>
+      <w:r>
+        <w:t>spuntare</w:t>
+      </w:r>
+      <w:proofErr w:type="gramEnd"/>
+      <w:r>
+        <w:t xml:space="preserve"> </w:t>
       </w:r>
       <w:r>
         <w:rPr>
@@ -3171,26 +3260,30 @@
     <w:p>
       <w:pPr>
         <w:keepNext/>
-        <w:spacing w:before="240"/>
         <w:jc w:val="center"/>
       </w:pPr>
       <w:r>
+        <w:rPr>
+          <w:noProof/>
+        </w:rPr>
+        <w:lastRenderedPageBreak/>
         <w:drawing>
-          <wp:inline xmlns:a="http://schemas.openxmlformats.org/drawingml/2006/main" xmlns:pic="http://schemas.openxmlformats.org/drawingml/2006/picture">
+          <wp:inline distT="0" distB="0" distL="0" distR="0" wp14:anchorId="7919A6FE" wp14:editId="68286A2A">
             <wp:extent cx="3960000" cy="2002799"/>
+            <wp:effectExtent l="0" t="0" r="0" b="0"/>
             <wp:docPr id="10" name="Picture 10"/>
             <wp:cNvGraphicFramePr>
-              <a:graphicFrameLocks noChangeAspect="1"/>
+              <a:graphicFrameLocks xmlns:a="http://schemas.openxmlformats.org/drawingml/2006/main" noChangeAspect="1"/>
             </wp:cNvGraphicFramePr>
-            <a:graphic>
+            <a:graphic xmlns:a="http://schemas.openxmlformats.org/drawingml/2006/main">
               <a:graphicData uri="http://schemas.openxmlformats.org/drawingml/2006/picture">
-                <pic:pic>
+                <pic:pic xmlns:pic="http://schemas.openxmlformats.org/drawingml/2006/picture">
                   <pic:nvPicPr>
                     <pic:cNvPr id="0" name="u-027-068.png"/>
                     <pic:cNvPicPr/>
                   </pic:nvPicPr>
                   <pic:blipFill>
-                    <a:blip r:embed="rId31"/>
+                    <a:blip r:embed="rId17"/>
                     <a:stretch>
                       <a:fillRect/>
                     </a:stretch>
@@ -3200,7 +3293,9 @@
                       <a:off x="0" y="0"/>
                       <a:ext cx="3960000" cy="2002799"/>
                     </a:xfrm>
-                    <a:prstGeom prst="rect"/>
+                    <a:prstGeom prst="rect">
+                      <a:avLst/>
+                    </a:prstGeom>
                   </pic:spPr>
                 </pic:pic>
               </a:graphicData>
@@ -3226,26 +3321,29 @@
     <w:p>
       <w:pPr>
         <w:keepNext/>
-        <w:spacing w:before="240"/>
         <w:jc w:val="center"/>
       </w:pPr>
       <w:r>
+        <w:rPr>
+          <w:noProof/>
+        </w:rPr>
         <w:drawing>
-          <wp:inline xmlns:a="http://schemas.openxmlformats.org/drawingml/2006/main" xmlns:pic="http://schemas.openxmlformats.org/drawingml/2006/picture">
+          <wp:inline distT="0" distB="0" distL="0" distR="0" wp14:anchorId="717DABE4" wp14:editId="7D383379">
             <wp:extent cx="3240000" cy="2777659"/>
+            <wp:effectExtent l="0" t="0" r="0" b="0"/>
             <wp:docPr id="11" name="Picture 11"/>
             <wp:cNvGraphicFramePr>
-              <a:graphicFrameLocks noChangeAspect="1"/>
+              <a:graphicFrameLocks xmlns:a="http://schemas.openxmlformats.org/drawingml/2006/main" noChangeAspect="1"/>
             </wp:cNvGraphicFramePr>
-            <a:graphic>
+            <a:graphic xmlns:a="http://schemas.openxmlformats.org/drawingml/2006/main">
               <a:graphicData uri="http://schemas.openxmlformats.org/drawingml/2006/picture">
-                <pic:pic>
+                <pic:pic xmlns:pic="http://schemas.openxmlformats.org/drawingml/2006/picture">
                   <pic:nvPicPr>
                     <pic:cNvPr id="0" name="u-027-069.png"/>
                     <pic:cNvPicPr/>
                   </pic:nvPicPr>
                   <pic:blipFill>
-                    <a:blip r:embed="rId32"/>
+                    <a:blip r:embed="rId18"/>
                     <a:stretch>
                       <a:fillRect/>
                     </a:stretch>
@@ -3255,7 +3353,9 @@
                       <a:off x="0" y="0"/>
                       <a:ext cx="3240000" cy="2777659"/>
                     </a:xfrm>
-                    <a:prstGeom prst="rect"/>
+                    <a:prstGeom prst="rect">
+                      <a:avLst/>
+                    </a:prstGeom>
                   </pic:spPr>
                 </pic:pic>
               </a:graphicData>
@@ -3281,26 +3381,29 @@
     <w:p>
       <w:pPr>
         <w:keepNext/>
-        <w:spacing w:before="240"/>
         <w:jc w:val="center"/>
       </w:pPr>
       <w:r>
+        <w:rPr>
+          <w:noProof/>
+        </w:rPr>
         <w:drawing>
-          <wp:inline xmlns:a="http://schemas.openxmlformats.org/drawingml/2006/main" xmlns:pic="http://schemas.openxmlformats.org/drawingml/2006/picture">
+          <wp:inline distT="0" distB="0" distL="0" distR="0" wp14:anchorId="701BADA7" wp14:editId="70E1D3E1">
             <wp:extent cx="3960000" cy="2432825"/>
+            <wp:effectExtent l="0" t="0" r="0" b="0"/>
             <wp:docPr id="12" name="Picture 12"/>
             <wp:cNvGraphicFramePr>
-              <a:graphicFrameLocks noChangeAspect="1"/>
+              <a:graphicFrameLocks xmlns:a="http://schemas.openxmlformats.org/drawingml/2006/main" noChangeAspect="1"/>
             </wp:cNvGraphicFramePr>
-            <a:graphic>
+            <a:graphic xmlns:a="http://schemas.openxmlformats.org/drawingml/2006/main">
               <a:graphicData uri="http://schemas.openxmlformats.org/drawingml/2006/picture">
-                <pic:pic>
+                <pic:pic xmlns:pic="http://schemas.openxmlformats.org/drawingml/2006/picture">
                   <pic:nvPicPr>
                     <pic:cNvPr id="0" name="u-028-071.png"/>
                     <pic:cNvPicPr/>
                   </pic:nvPicPr>
                   <pic:blipFill>
-                    <a:blip r:embed="rId33"/>
+                    <a:blip r:embed="rId19"/>
                     <a:stretch>
                       <a:fillRect/>
                     </a:stretch>
@@ -3310,7 +3413,9 @@
                       <a:off x="0" y="0"/>
                       <a:ext cx="3960000" cy="2432825"/>
                     </a:xfrm>
-                    <a:prstGeom prst="rect"/>
+                    <a:prstGeom prst="rect">
+                      <a:avLst/>
+                    </a:prstGeom>
                   </pic:spPr>
                 </pic:pic>
               </a:graphicData>
@@ -3330,7 +3435,25 @@
           <w:color w:val="595959"/>
           <w:sz w:val="18"/>
         </w:rPr>
-        <w:t>Figura 12 – StartCenter → Avanzate → Esegui come amministratore (schermata reale)</w:t>
+        <w:t xml:space="preserve">Figura 12 – </w:t>
+      </w:r>
+      <w:proofErr w:type="spellStart"/>
+      <w:r>
+        <w:rPr>
+          <w:i/>
+          <w:color w:val="595959"/>
+          <w:sz w:val="18"/>
+        </w:rPr>
+        <w:t>StartCenter</w:t>
+      </w:r>
+      <w:proofErr w:type="spellEnd"/>
+      <w:r>
+        <w:rPr>
+          <w:i/>
+          <w:color w:val="595959"/>
+          <w:sz w:val="18"/>
+        </w:rPr>
+        <w:t xml:space="preserve"> → Avanzate → Esegui come amministratore (schermata reale)</w:t>
       </w:r>
     </w:p>
     <w:p>
@@ -3342,12 +3465,21 @@
         <w:spacing w:before="120" w:after="200"/>
         <w:ind w:left="200" w:right="200"/>
       </w:pPr>
+      <w:proofErr w:type="gramStart"/>
       <w:r>
         <w:rPr>
           <w:b/>
           <w:color w:val="1F4E79"/>
         </w:rPr>
-        <w:t xml:space="preserve">NOTA  </w:t>
+        <w:t>NOTA</w:t>
+      </w:r>
+      <w:proofErr w:type="gramEnd"/>
+      <w:r>
+        <w:rPr>
+          <w:b/>
+          <w:color w:val="1F4E79"/>
+        </w:rPr>
+        <w:t xml:space="preserve"> </w:t>
       </w:r>
       <w:r>
         <w:t>Il Panel PC non va sincronizzato direttamente con il servizio ora di Windows verso il server NTP: la sorgente unica dell'ora deve restare il PLC, altrimenti PLC e HMI possono divergere.</w:t>
@@ -3358,6 +3490,7 @@
         <w:pStyle w:val="Titolo1"/>
       </w:pPr>
       <w:r>
+        <w:lastRenderedPageBreak/>
         <w:t>7. Collaudo</w:t>
       </w:r>
     </w:p>
@@ -3382,7 +3515,15 @@
         </w:numPr>
       </w:pPr>
       <w:r>
-        <w:t>Aprire e chiudere un lotto: i TimeStamp nel file Audit devono corrispondere all'ora del server.</w:t>
+        <w:t xml:space="preserve">Aprire e chiudere un lotto: i </w:t>
+      </w:r>
+      <w:proofErr w:type="spellStart"/>
+      <w:r>
+        <w:t>TimeStamp</w:t>
+      </w:r>
+      <w:proofErr w:type="spellEnd"/>
+      <w:r>
+        <w:t xml:space="preserve"> nel file Audit devono corrispondere all'ora del server.</w:t>
       </w:r>
     </w:p>
     <w:p>
@@ -3431,23 +3572,21 @@
     </w:p>
     <w:tbl>
       <w:tblPr>
+        <w:tblW w:w="0" w:type="auto"/>
         <w:jc w:val="center"/>
-        <w:tblLook w:firstColumn="1" w:firstRow="1" w:lastColumn="0" w:lastRow="0" w:noHBand="0" w:noVBand="1" w:val="04A0"/>
-        <w:tblW w:w="9638" w:type="dxa"/>
-        <w:tblLayout w:type="fixed"/>
+        <w:tblLook w:val="04A0" w:firstRow="1" w:lastRow="0" w:firstColumn="1" w:lastColumn="0" w:noHBand="0" w:noVBand="1"/>
       </w:tblPr>
       <w:tblGrid>
-        <w:gridCol w:w="3400"/>
-        <w:gridCol w:w="6238"/>
+        <w:gridCol w:w="3397"/>
+        <w:gridCol w:w="6231"/>
       </w:tblGrid>
       <w:tr>
         <w:trPr>
-          <w:cantSplit/>
           <w:tblHeader/>
+          <w:jc w:val="center"/>
         </w:trPr>
         <w:tc>
           <w:tcPr>
-            <w:tcW w:type="dxa" w:w="4819"/>
             <w:tcW w:w="3400" w:type="dxa"/>
             <w:tcBorders>
               <w:top w:val="single" w:sz="4" w:space="0" w:color="A6A6A6"/>
@@ -3464,9 +3603,6 @@
             </w:tcMar>
           </w:tcPr>
           <w:p>
-            <w:pPr>
-              <w:spacing w:after="0"/>
-            </w:pPr>
             <w:r>
               <w:rPr>
                 <w:b/>
@@ -3478,7 +3614,6 @@
         </w:tc>
         <w:tc>
           <w:tcPr>
-            <w:tcW w:type="dxa" w:w="4819"/>
             <w:tcW w:w="6238" w:type="dxa"/>
             <w:tcBorders>
               <w:top w:val="single" w:sz="4" w:space="0" w:color="A6A6A6"/>
@@ -3495,9 +3630,6 @@
             </w:tcMar>
           </w:tcPr>
           <w:p>
-            <w:pPr>
-              <w:spacing w:after="0"/>
-            </w:pPr>
             <w:r>
               <w:rPr>
                 <w:b/>
@@ -3510,11 +3642,10 @@
       </w:tr>
       <w:tr>
         <w:trPr>
-          <w:cantSplit/>
+          <w:jc w:val="center"/>
         </w:trPr>
         <w:tc>
           <w:tcPr>
-            <w:tcW w:type="dxa" w:w="4819"/>
             <w:tcW w:w="3400" w:type="dxa"/>
             <w:tcBorders>
               <w:top w:val="single" w:sz="4" w:space="0" w:color="A6A6A6"/>
@@ -3530,9 +3661,6 @@
             </w:tcMar>
           </w:tcPr>
           <w:p>
-            <w:pPr>
-              <w:spacing w:after="0"/>
-            </w:pPr>
             <w:r>
               <w:t>Il PLC non si sincronizza</w:t>
             </w:r>
@@ -3540,7 +3668,6 @@
         </w:tc>
         <w:tc>
           <w:tcPr>
-            <w:tcW w:type="dxa" w:w="4819"/>
             <w:tcW w:w="6238" w:type="dxa"/>
             <w:tcBorders>
               <w:top w:val="single" w:sz="4" w:space="0" w:color="A6A6A6"/>
@@ -3556,9 +3683,6 @@
             </w:tcMar>
           </w:tcPr>
           <w:p>
-            <w:pPr>
-              <w:spacing w:after="0"/>
-            </w:pPr>
             <w:r>
               <w:t>Ping al server dalla rete del PLC; IP/gateway dell'interfaccia; porta UDP 123 aperta; spunta NTP attiva sull'interfaccia giusta.</w:t>
             </w:r>
@@ -3567,11 +3691,10 @@
       </w:tr>
       <w:tr>
         <w:trPr>
-          <w:cantSplit/>
+          <w:jc w:val="center"/>
         </w:trPr>
         <w:tc>
           <w:tcPr>
-            <w:tcW w:type="dxa" w:w="4819"/>
             <w:tcW w:w="3400" w:type="dxa"/>
             <w:tcBorders>
               <w:top w:val="single" w:sz="4" w:space="0" w:color="A6A6A6"/>
@@ -3588,9 +3711,6 @@
             </w:tcMar>
           </w:tcPr>
           <w:p>
-            <w:pPr>
-              <w:spacing w:after="0"/>
-            </w:pPr>
             <w:r>
               <w:t>Ora sfasata di 1 o 2 ore</w:t>
             </w:r>
@@ -3598,7 +3718,6 @@
         </w:tc>
         <w:tc>
           <w:tcPr>
-            <w:tcW w:type="dxa" w:w="4819"/>
             <w:tcW w:w="6238" w:type="dxa"/>
             <w:tcBorders>
               <w:top w:val="single" w:sz="4" w:space="0" w:color="A6A6A6"/>
@@ -3615,9 +3734,6 @@
             </w:tcMar>
           </w:tcPr>
           <w:p>
-            <w:pPr>
-              <w:spacing w:after="0"/>
-            </w:pPr>
             <w:r>
               <w:t xml:space="preserve">Fuso orario / ora legale (TIA: Proprietà → Ora; STEP 7: fuso orario nella scheda NTP). L'HMI deve ricevere l'ora </w:t>
             </w:r>
@@ -3635,11 +3751,10 @@
       </w:tr>
       <w:tr>
         <w:trPr>
-          <w:cantSplit/>
+          <w:jc w:val="center"/>
         </w:trPr>
         <w:tc>
           <w:tcPr>
-            <w:tcW w:type="dxa" w:w="4819"/>
             <w:tcW w:w="3400" w:type="dxa"/>
             <w:tcBorders>
               <w:top w:val="single" w:sz="4" w:space="0" w:color="A6A6A6"/>
@@ -3655,9 +3770,6 @@
             </w:tcMar>
           </w:tcPr>
           <w:p>
-            <w:pPr>
-              <w:spacing w:after="0"/>
-            </w:pPr>
             <w:r>
               <w:t>S7-300 con CP: la CPU non prende l'ora</w:t>
             </w:r>
@@ -3665,7 +3777,6 @@
         </w:tc>
         <w:tc>
           <w:tcPr>
-            <w:tcW w:type="dxa" w:w="4819"/>
             <w:tcW w:w="6238" w:type="dxa"/>
             <w:tcBorders>
               <w:top w:val="single" w:sz="4" w:space="0" w:color="A6A6A6"/>
@@ -3681,9 +3792,6 @@
             </w:tcMar>
           </w:tcPr>
           <w:p>
-            <w:pPr>
-              <w:spacing w:after="0"/>
-            </w:pPr>
             <w:r>
               <w:t xml:space="preserve">"Inoltra l'ora alla stazione" sul CP e CPU in Diagnostica/Orologio come </w:t>
             </w:r>
@@ -3701,11 +3809,10 @@
       </w:tr>
       <w:tr>
         <w:trPr>
-          <w:cantSplit/>
+          <w:jc w:val="center"/>
         </w:trPr>
         <w:tc>
           <w:tcPr>
-            <w:tcW w:type="dxa" w:w="4819"/>
             <w:tcW w:w="3400" w:type="dxa"/>
             <w:tcBorders>
               <w:top w:val="single" w:sz="4" w:space="0" w:color="A6A6A6"/>
@@ -3722,9 +3829,6 @@
             </w:tcMar>
           </w:tcPr>
           <w:p>
-            <w:pPr>
-              <w:spacing w:after="0"/>
-            </w:pPr>
             <w:r>
               <w:t>Pannello con ora diversa dal PLC</w:t>
             </w:r>
@@ -3732,7 +3836,6 @@
         </w:tc>
         <w:tc>
           <w:tcPr>
-            <w:tcW w:type="dxa" w:w="4819"/>
             <w:tcW w:w="6238" w:type="dxa"/>
             <w:tcBorders>
               <w:top w:val="single" w:sz="4" w:space="0" w:color="A6A6A6"/>
@@ -3749,22 +3852,26 @@
             </w:tcMar>
           </w:tcPr>
           <w:p>
-            <w:pPr>
-              <w:spacing w:after="0"/>
-            </w:pPr>
             <w:r>
-              <w:t>Puntatore Data/ora PLC o modalità Slave non attivi; ciclo di acquisizione troppo lungo.</w:t>
+              <w:t xml:space="preserve">Puntatore Data/ora PLC o modalità </w:t>
+            </w:r>
+            <w:proofErr w:type="gramStart"/>
+            <w:r>
+              <w:t>Slave</w:t>
+            </w:r>
+            <w:proofErr w:type="gramEnd"/>
+            <w:r>
+              <w:t xml:space="preserve"> non attivi; ciclo di acquisizione troppo lungo.</w:t>
             </w:r>
           </w:p>
         </w:tc>
       </w:tr>
       <w:tr>
         <w:trPr>
-          <w:cantSplit/>
+          <w:jc w:val="center"/>
         </w:trPr>
         <w:tc>
           <w:tcPr>
-            <w:tcW w:type="dxa" w:w="4819"/>
             <w:tcW w:w="3400" w:type="dxa"/>
             <w:tcBorders>
               <w:top w:val="single" w:sz="4" w:space="0" w:color="A6A6A6"/>
@@ -3780,9 +3887,6 @@
             </w:tcMar>
           </w:tcPr>
           <w:p>
-            <w:pPr>
-              <w:spacing w:after="0"/>
-            </w:pPr>
             <w:r>
               <w:t>Panel PC con ora non aggiornata</w:t>
             </w:r>
@@ -3790,7 +3894,6 @@
         </w:tc>
         <w:tc>
           <w:tcPr>
-            <w:tcW w:type="dxa" w:w="4819"/>
             <w:tcW w:w="6238" w:type="dxa"/>
             <w:tcBorders>
               <w:top w:val="single" w:sz="4" w:space="0" w:color="A6A6A6"/>
@@ -3806,22 +3909,26 @@
             </w:tcMar>
           </w:tcPr>
           <w:p>
-            <w:pPr>
-              <w:spacing w:after="0"/>
-            </w:pPr>
             <w:r>
-              <w:t>Controllo account utente, StartCenter come amministratore, riavvio.</w:t>
+              <w:t xml:space="preserve">Controllo account utente, </w:t>
+            </w:r>
+            <w:proofErr w:type="spellStart"/>
+            <w:r>
+              <w:t>StartCenter</w:t>
+            </w:r>
+            <w:proofErr w:type="spellEnd"/>
+            <w:r>
+              <w:t xml:space="preserve"> come amministratore, riavvio.</w:t>
             </w:r>
           </w:p>
         </w:tc>
       </w:tr>
       <w:tr>
         <w:trPr>
-          <w:cantSplit/>
+          <w:jc w:val="center"/>
         </w:trPr>
         <w:tc>
           <w:tcPr>
-            <w:tcW w:type="dxa" w:w="4819"/>
             <w:tcW w:w="3400" w:type="dxa"/>
             <w:tcBorders>
               <w:top w:val="single" w:sz="4" w:space="0" w:color="A6A6A6"/>
@@ -3838,9 +3945,6 @@
             </w:tcMar>
           </w:tcPr>
           <w:p>
-            <w:pPr>
-              <w:spacing w:after="0"/>
-            </w:pPr>
             <w:r>
               <w:t>L'ora cambiata a mano torna indietro</w:t>
             </w:r>
@@ -3848,7 +3952,6 @@
         </w:tc>
         <w:tc>
           <w:tcPr>
-            <w:tcW w:type="dxa" w:w="4819"/>
             <w:tcW w:w="6238" w:type="dxa"/>
             <w:tcBorders>
               <w:top w:val="single" w:sz="4" w:space="0" w:color="A6A6A6"/>
@@ -3865,9 +3968,6 @@
             </w:tcMar>
           </w:tcPr>
           <w:p>
-            <w:pPr>
-              <w:spacing w:after="0"/>
-            </w:pPr>
             <w:r>
               <w:t>Comportamento corretto con NTP attivo.</w:t>
             </w:r>
@@ -3877,12 +3977,12 @@
     </w:tbl>
     <w:p/>
     <w:sectPr>
-      <w:headerReference w:type="even" r:id="rId14"/>
-      <w:headerReference w:type="default" r:id="rId15"/>
-      <w:footerReference w:type="even" r:id="rId16"/>
-      <w:footerReference w:type="default" r:id="rId17"/>
-      <w:headerReference w:type="first" r:id="rId18"/>
-      <w:footerReference w:type="first" r:id="rId19"/>
+      <w:headerReference w:type="even" r:id="rId20"/>
+      <w:headerReference w:type="default" r:id="rId21"/>
+      <w:footerReference w:type="even" r:id="rId22"/>
+      <w:footerReference w:type="default" r:id="rId23"/>
+      <w:headerReference w:type="first" r:id="rId24"/>
+      <w:footerReference w:type="first" r:id="rId25"/>
       <w:pgSz w:w="11906" w:h="16838"/>
       <w:pgMar w:top="1134" w:right="1134" w:bottom="1134" w:left="1134" w:header="708" w:footer="708" w:gutter="0"/>
       <w:cols w:space="720"/>
@@ -5496,55 +5596,55 @@
       <w:startOverride w:val="1"/>
     </w:lvlOverride>
   </w:num>
-  <w:num w:numId="9">
+  <w:num w:numId="9" w16cid:durableId="971711867">
     <w:abstractNumId w:val="7"/>
     <w:lvlOverride w:ilvl="0">
       <w:startOverride w:val="1"/>
     </w:lvlOverride>
   </w:num>
-  <w:num w:numId="10">
+  <w:num w:numId="10" w16cid:durableId="1405835446">
     <w:abstractNumId w:val="7"/>
     <w:lvlOverride w:ilvl="0">
       <w:startOverride w:val="1"/>
     </w:lvlOverride>
   </w:num>
-  <w:num w:numId="11">
+  <w:num w:numId="11" w16cid:durableId="1824423328">
     <w:abstractNumId w:val="7"/>
     <w:lvlOverride w:ilvl="0">
       <w:startOverride w:val="1"/>
     </w:lvlOverride>
   </w:num>
-  <w:num w:numId="12">
+  <w:num w:numId="12" w16cid:durableId="91164706">
     <w:abstractNumId w:val="7"/>
     <w:lvlOverride w:ilvl="0">
       <w:startOverride w:val="1"/>
     </w:lvlOverride>
   </w:num>
-  <w:num w:numId="13">
+  <w:num w:numId="13" w16cid:durableId="1153447403">
     <w:abstractNumId w:val="7"/>
     <w:lvlOverride w:ilvl="0">
       <w:startOverride w:val="1"/>
     </w:lvlOverride>
   </w:num>
-  <w:num w:numId="14">
+  <w:num w:numId="14" w16cid:durableId="349574015">
     <w:abstractNumId w:val="7"/>
     <w:lvlOverride w:ilvl="0">
       <w:startOverride w:val="1"/>
     </w:lvlOverride>
   </w:num>
-  <w:num w:numId="15">
+  <w:num w:numId="15" w16cid:durableId="1708069927">
     <w:abstractNumId w:val="7"/>
     <w:lvlOverride w:ilvl="0">
       <w:startOverride w:val="1"/>
     </w:lvlOverride>
   </w:num>
-  <w:num w:numId="16">
+  <w:num w:numId="16" w16cid:durableId="115024496">
     <w:abstractNumId w:val="7"/>
     <w:lvlOverride w:ilvl="0">
       <w:startOverride w:val="1"/>
     </w:lvlOverride>
   </w:num>
-  <w:num w:numId="17">
+  <w:num w:numId="17" w16cid:durableId="2039234979">
     <w:abstractNumId w:val="7"/>
     <w:lvlOverride w:ilvl="0">
       <w:startOverride w:val="1"/>
@@ -6519,4 +6619,16 @@
     </a:ext>
   </a:extLst>
 </a:theme>
+</file>
+
+<file path=customXml/item1.xml><?xml version="1.0" encoding="utf-8"?>
+<b:Sources xmlns:b="http://schemas.openxmlformats.org/officeDocument/2006/bibliography" xmlns="http://schemas.openxmlformats.org/officeDocument/2006/bibliography" SelectedStyle="\APASixthEditionOfficeOnline.xsl" StyleName="APA" Version="6"/>
+</file>
+
+<file path=customXml/itemProps1.xml><?xml version="1.0" encoding="utf-8"?>
+<ds:datastoreItem xmlns:ds="http://schemas.openxmlformats.org/officeDocument/2006/customXml" ds:itemID="{F3C713C7-ECAC-4C27-A02D-4465BCD76DC4}">
+  <ds:schemaRefs>
+    <ds:schemaRef ds:uri="http://schemas.openxmlformats.org/officeDocument/2006/bibliography"/>
+  </ds:schemaRefs>
+</ds:datastoreItem>
 </file>
</xml_diff>